<commit_message>
feat(pos): refine UI and submission report to AURA POS and Operations Terminal
</commit_message>
<xml_diff>
--- a/docs/AI_Business_Operations_Agent_Report.docx
+++ b/docs/AI_Business_Operations_Agent_Report.docx
@@ -13,7 +13,7 @@
           <w:color w:val="1E40AF"/>
           <w:sz w:val="48"/>
         </w:rPr>
-        <w:t>AI Small Business Operations Agent</w:t>
+        <w:t>AURA POS — AI Smart Retail &amp; Operations Terminal</w:t>
       </w:r>
     </w:p>
     <w:p>
@@ -26,7 +26,7 @@
           <w:color w:val="64748B"/>
           <w:sz w:val="22"/>
         </w:rPr>
-        <w:t>Autonomous Order Processing, Multi-Path AI Decision Routing, and Automated Operations</w:t>
+        <w:t>Autonomous Conversational Checkout, Multi-Path AI Decision Routing, and Automated Operations</w:t>
         <w:br/>
         <w:t>Assignment Submission Report</w:t>
       </w:r>
@@ -127,12 +127,12 @@
     </w:p>
     <w:p>
       <w:r>
-        <w:t>Small-to-medium retail and e-commerce businesses frequently struggle with managing customer orders, stock level verification, customer inquiries, and order approvals through disjointed manual workflows. Store owners and support staff typically read each incoming message by hand, manually inspect spreadsheet inventory, calculate totals, decide fulfillment options, and formulate individual response messages.</w:t>
+        <w:t>Small-to-medium retail shops, boutique stores, and counter sales operations frequently struggle with managing customer transactions, shelf stock level verification, customer inquiries, and order approval governance through disjointed manual workflows. Store cashiers and staff typically ring up or take phone orders manually, cross-reference spreadsheet inventory by hand, manually check whether high-value purchases require manager override approval, and struggle to coordinate out-of-stock color variants on the fly.</w:t>
       </w:r>
     </w:p>
     <w:p>
       <w:r>
-        <w:t>This manual mode of operation introduces severe operational friction:</w:t>
+        <w:t>This manual mode of counter and sales operation introduces severe operational friction:</w:t>
       </w:r>
     </w:p>
     <w:p>
@@ -144,40 +144,40 @@
         <w:rPr>
           <w:b/>
         </w:rPr>
-        <w:t xml:space="preserve">• Delayed Customer Response Times: </w:t>
+        <w:t xml:space="preserve">• Slow Checkout &amp; Phone Order Ring-Up: </w:t>
       </w:r>
       <w:r>
-        <w:t>Manual handling causes response bottlenecks, especially outside business hours, leading to abandoned inquiries and lost revenue.</w:t>
+        <w:t>Cashiers spend precious minutes manually deciphering customer requests, typing SKUs, and checking shelf counts, causing customer queues at the counter.</w:t>
         <w:br/>
       </w:r>
       <w:r>
         <w:rPr>
           <w:b/>
         </w:rPr>
-        <w:t xml:space="preserve">• Stock Inaccuracies &amp; Overselling: </w:t>
+        <w:t xml:space="preserve">• Stock Inaccuracies &amp; Shelf Desynchronization: </w:t>
       </w:r>
       <w:r>
-        <w:t>Manual coordination between chat platforms and inventory spreadsheets causes stock desynchronization, resulting in oversold items and customer dissatisfaction.</w:t>
+        <w:t>Discrepancies between physical shelf stock and central inventory sheets cause stockouts and overselling during peak hours.</w:t>
         <w:br/>
       </w:r>
       <w:r>
         <w:rPr>
           <w:b/>
         </w:rPr>
-        <w:t xml:space="preserve">• Inconsistent Business Decision-Making: </w:t>
+        <w:t xml:space="preserve">• Inconsistent Manager Approval Governance: </w:t>
       </w:r>
       <w:r>
-        <w:t>Staff members apply discount rules, escalation thresholds, and substitution criteria inconsistently across channels.</w:t>
+        <w:t>Staff members apply discount rules, high-ticket escalation thresholds, and substitution criteria inconsistently across shifts.</w:t>
         <w:br/>
       </w:r>
       <w:r>
         <w:rPr>
           <w:b/>
         </w:rPr>
-        <w:t xml:space="preserve">• High Human Overhead on Low-Value Tasks: </w:t>
+        <w:t xml:space="preserve">• High Friction on Product Substitutions: </w:t>
       </w:r>
       <w:r>
-        <w:t>Routine tasks (checking stock for a t-shirt or calculating order totals) consume hours of manual labor that could be automated autonomously.</w:t>
+        <w:t>When a customer requests an out-of-stock color or size, staff rarely have instant visibility into backstock alternatives, leading to abandoned sales.</w:t>
       </w:r>
     </w:p>
     <w:tbl>
@@ -219,7 +219,7 @@
                 <w:color w:val="334155"/>
                 <w:sz w:val="19"/>
               </w:rPr>
-              <w:t>Target Real-World Problem: Manual small-business operations suffer from delayed order fulfillment, stock desynchronization, and human error. An intelligent autonomous AI agent is needed to bridge natural customer communications, live inventory, business rules, and instant multi-party notifications with zero manual data entry.</w:t>
+              <w:t>Target Real-World Problem: Manual retail point-of-sale and counter operations suffer from delayed order fulfillment, stock desynchronization, and human error. An intelligent autonomous AI POS terminal is needed to bridge natural customer communications, live shelf inventory, business rules (e.g. Manager Override for &gt;= $100), and instant multi-party alerts with zero manual data entry.</w:t>
             </w:r>
           </w:p>
         </w:tc>
@@ -244,7 +244,7 @@
     </w:p>
     <w:p>
       <w:r>
-        <w:t>We propose the AI Small Business Operations Agent — an autonomous end-to-end intelligent system designed to receive conversational order requests, parse unstructured intent using the DeepSeek Large Language Model (deepseek-chat), query real-time stock from Google Sheets, autonomously evaluate fulfillment rules, and route the workflow through five distinct operational paths while sending real-time Telegram notifications.</w:t>
+        <w:t>We propose AURA POS — an autonomous end-to-end AI Smart Retail and Order Operations Terminal designed to receive conversational counter, phone, or messaging order requests, parse unstructured intent using the DeepSeek Large Language Model (deepseek-chat), query real-time shelf stock from Google Sheets, autonomously evaluate fulfillment and governance rules (e.g., auto-approving small sales vs. escalating high-value orders for manager override), and route the workflow through five distinct operational paths while sending real-time Telegram alerts and receipts.</w:t>
       </w:r>
     </w:p>
     <w:p>
@@ -260,10 +260,10 @@
         <w:rPr>
           <w:b/>
         </w:rPr>
-        <w:t xml:space="preserve">1. Conversational Understanding: </w:t>
+        <w:t xml:space="preserve">1. Conversational POS Checkout: </w:t>
       </w:r>
       <w:r>
-        <w:t>Understands natural, unstructured customer phrasing (e.g., 'I want 2 black Basic Shirts' or 'Do you have blue jeans?') without strict forms.</w:t>
+        <w:t>Understands natural, unstructured customer phrasing (e.g., 'Customer wants 2 black basic shirts' or '12 shirts for team event') without clunky catalog lookups.</w:t>
         <w:br/>
       </w:r>
       <w:r>
@@ -273,7 +273,7 @@
         <w:t xml:space="preserve">2. Real-Time Tool Integration: </w:t>
       </w:r>
       <w:r>
-        <w:t>Integrates live Google Sheets API for inventory deduction, order logging, and audit tracking, and Telegram Bot API for customer confirmations and owner alerts.</w:t>
+        <w:t>Integrates live Google Sheets API for shelf inventory deduction, transaction logging, and register audit tracking, alongside Telegram Bot API for instant customer receipts and owner alerts.</w:t>
         <w:br/>
       </w:r>
       <w:r>
@@ -283,17 +283,17 @@
         <w:t xml:space="preserve">3. Multi-Path Autonomous Routing: </w:t>
       </w:r>
       <w:r>
-        <w:t>Autonomously determines whether to auto-approve, escalate to human owner for approval, recommend alternative products when out of stock, clarify ambiguity, or reject.</w:t>
+        <w:t>Autonomously determines whether to auto-approve (&lt;$100), escalate for Manager Override (&gt;= $100), recommend alternative variants on stock-outs, clarify missing details, or reject.</w:t>
         <w:br/>
       </w:r>
       <w:r>
         <w:rPr>
           <w:b/>
         </w:rPr>
-        <w:t xml:space="preserve">4. Hybrid Orchestration: </w:t>
+        <w:t xml:space="preserve">4. Hybrid Terminal Orchestration: </w:t>
       </w:r>
       <w:r>
-        <w:t>Can run as an n8n visual workflow orchestration or as a standalone Python application (CLI &amp; Web UI) with in-memory resilient fallback.</w:t>
+        <w:t>Can operate as an interactive POS Web Terminal (Flask UI), standalone Python CLI terminal, or enterprise n8n workflow graph with resilient zero-downtime offline fallback.</w:t>
       </w:r>
     </w:p>
     <w:p>
@@ -1331,7 +1331,7 @@
               <w:rPr>
                 <w:sz w:val="17"/>
               </w:rPr>
-              <w:t>Flask Web UI / CLI / Webhook</w:t>
+              <w:t>AURA POS Web Terminal / CLI / Webhook</w:t>
             </w:r>
           </w:p>
         </w:tc>
@@ -1348,7 +1348,7 @@
               <w:rPr>
                 <w:sz w:val="17"/>
               </w:rPr>
-              <w:t>Accepts natural language customer messages from browser, terminal, or API.</w:t>
+              <w:t>Accepts natural language orders from register screen, phone order desk, or API.</w:t>
             </w:r>
           </w:p>
         </w:tc>
@@ -1604,7 +1604,7 @@
               <w:rPr>
                 <w:sz w:val="17"/>
               </w:rPr>
-              <w:t>Dispatches instant alerts and proposals to customer and owner chat IDs.</w:t>
+              <w:t>Dispatches instant digital receipts to customer and manager escalation alerts to owner.</w:t>
             </w:r>
           </w:p>
         </w:tc>
@@ -1861,7 +1861,7 @@
               <w:rPr>
                 <w:sz w:val="17"/>
               </w:rPr>
-              <w:t>Provides persistent tables for Products, Orders, Customers, and Logs.</w:t>
+              <w:t>Provides persistent tables for Products shelf inventory, Orders, Customers, and Logs.</w:t>
             </w:r>
           </w:p>
         </w:tc>
@@ -1931,7 +1931,7 @@
               <w:rPr>
                 <w:sz w:val="17"/>
               </w:rPr>
-              <w:t>Delivers real-time customer confirmations and escalation alerts to owner chat.</w:t>
+              <w:t>Delivers real-time customer receipts and manager override alerts to owner chat.</w:t>
             </w:r>
           </w:p>
         </w:tc>
@@ -1997,7 +1997,7 @@
               <w:rPr>
                 <w:sz w:val="17"/>
               </w:rPr>
-              <w:t>Visual node-based workflow alternative for enterprise automation environments.</w:t>
+              <w:t>Visual node-based workflow alternative for enterprise retail automation environments.</w:t>
             </w:r>
           </w:p>
         </w:tc>
@@ -2033,7 +2033,7 @@
               <w:rPr>
                 <w:sz w:val="17"/>
               </w:rPr>
-              <w:t>Web Interface</w:t>
+              <w:t>POS Web Terminal</w:t>
             </w:r>
           </w:p>
         </w:tc>
@@ -2067,7 +2067,7 @@
               <w:rPr>
                 <w:sz w:val="17"/>
               </w:rPr>
-              <w:t>Lightweight browser interface providing live status indicators and test buttons.</w:t>
+              <w:t>AURA POS cashier terminal interface featuring one-click presets, shelf stock, and live status.</w:t>
             </w:r>
           </w:p>
         </w:tc>
@@ -2277,7 +2277,7 @@
               <w:rPr>
                 <w:sz w:val="17"/>
               </w:rPr>
-              <w:t>approve</w:t>
+              <w:t>approve (Fast POS Sale)</w:t>
             </w:r>
           </w:p>
         </w:tc>
@@ -2328,7 +2328,7 @@
               <w:rPr>
                 <w:sz w:val="17"/>
               </w:rPr>
-              <w:t>Escalate high value</w:t>
+              <w:t>Manager Override</w:t>
             </w:r>
           </w:p>
         </w:tc>
@@ -2360,7 +2360,7 @@
               <w:rPr>
                 <w:sz w:val="17"/>
               </w:rPr>
-              <w:t>escalate</w:t>
+              <w:t>escalate (Manager Alert)</w:t>
             </w:r>
           </w:p>
         </w:tc>
@@ -2446,7 +2446,7 @@
               <w:rPr>
                 <w:sz w:val="17"/>
               </w:rPr>
-              <w:t>suggest_alternative</w:t>
+              <w:t>suggest_alternative (Shelf Stock-Out)</w:t>
             </w:r>
           </w:p>
         </w:tc>
@@ -2529,7 +2529,7 @@
               <w:rPr>
                 <w:sz w:val="17"/>
               </w:rPr>
-              <w:t>reject</w:t>
+              <w:t>reject (Unfulfillable)</w:t>
             </w:r>
           </w:p>
         </w:tc>
@@ -2615,7 +2615,7 @@
               <w:rPr>
                 <w:sz w:val="17"/>
               </w:rPr>
-              <w:t>clarify</w:t>
+              <w:t>clarify (Catalog Inquiry)</w:t>
             </w:r>
           </w:p>
         </w:tc>
@@ -2711,7 +2711,7 @@
           <w:color w:val="64748B"/>
           <w:sz w:val="17"/>
         </w:rPr>
-        <w:t>Figure 3: Web Dashboard with live DeepSeek, Telegram, and Sheets health indicators</w:t>
+        <w:t>Figure 3: AURA POS Smart Terminal Dashboard with live DeepSeek, Telegram, and Sheets health indicators</w:t>
       </w:r>
     </w:p>
     <w:p>
@@ -2765,7 +2765,7 @@
           <w:color w:val="64748B"/>
           <w:sz w:val="17"/>
         </w:rPr>
-        <w:t>Figure 4: Scenario 1 — Auto-Approval for order under $100 with stock deduction</w:t>
+        <w:t>Figure 4: Scenario 1 — Fast POS Checkout (Auto-Approval under $100 with immediate shelf stock deduction)</w:t>
       </w:r>
     </w:p>
     <w:p>
@@ -2819,7 +2819,7 @@
           <w:color w:val="64748B"/>
           <w:sz w:val="17"/>
         </w:rPr>
-        <w:t>Figure 5: Scenario 2 — Autonomous Escalation to Owner for high-value order ($120 &gt;= $100)</w:t>
+        <w:t>Figure 5: Scenario 2 — Manager Override Escalation to Store Owner for high-value sale ($120 &gt;= $100)</w:t>
       </w:r>
     </w:p>
     <w:p>
@@ -2873,7 +2873,7 @@
           <w:color w:val="64748B"/>
           <w:sz w:val="17"/>
         </w:rPr>
-        <w:t>Figure 6: Scenario 3 — Autonomous Suggestion of alternative variants on low stock</w:t>
+        <w:t>Figure 6: Scenario 3 — Autonomous Variant Suggestion triggered when shelf stock is insufficient</w:t>
       </w:r>
     </w:p>
     <w:p>
@@ -2927,7 +2927,7 @@
           <w:color w:val="64748B"/>
           <w:sz w:val="17"/>
         </w:rPr>
-        <w:t>Figure 7: Scenario 4 — Clarification Request triggered when an item is not found</w:t>
+        <w:t>Figure 7: Scenario 4 — Clarification Request triggered when an unrecognized item is requested at the register</w:t>
       </w:r>
     </w:p>
     <w:tbl>
@@ -3002,7 +3002,7 @@
         <w:pStyle w:val="Heading2"/>
       </w:pPr>
       <w:r>
-        <w:t>Scenario 1: Normal Order (Auto-Approve Flow)</w:t>
+        <w:t>Scenario 1: Fast Sale Checkout (Auto-Approve Flow)</w:t>
       </w:r>
     </w:p>
     <w:p>
@@ -3075,7 +3075,7 @@
         <w:pStyle w:val="Heading2"/>
       </w:pPr>
       <w:r>
-        <w:t>Scenario 2: Large Order (Autonomous Escalation Flow)</w:t>
+        <w:t>Scenario 2: High-Value Counter Order (Manager Override Escalation Flow)</w:t>
       </w:r>
     </w:p>
     <w:p>
@@ -3150,7 +3150,7 @@
         <w:pStyle w:val="Heading2"/>
       </w:pPr>
       <w:r>
-        <w:t>Scenario 3: Insufficient Stock (Autonomous Suggestion Flow)</w:t>
+        <w:t>Scenario 3: Insufficient Shelf Stock (Autonomous Variant Suggestion Flow)</w:t>
       </w:r>
     </w:p>
     <w:p>
@@ -3227,7 +3227,7 @@
         <w:pStyle w:val="Heading2"/>
       </w:pPr>
       <w:r>
-        <w:t>Scenario 4: Unknown Product (Clarification Flow)</w:t>
+        <w:t>Scenario 4: Unrecognized Item / SKU (Clarification Flow)</w:t>
       </w:r>
     </w:p>
     <w:p>
@@ -3356,15 +3356,15 @@
               <w:br/>
               <w:t>Demo Content Covered in Video:</w:t>
               <w:br/>
-              <w:t>1. Overview of the problem and architecture.</w:t>
+              <w:t>1. Overview of the retail POS problem and autonomous architecture.</w:t>
               <w:br/>
-              <w:t>2. Live execution in Web UI (http://localhost:5000) and CLI (python agent.py).</w:t>
+              <w:t>2. Live transaction ring-up in AURA POS Web Terminal (http://localhost:5000) and CLI (python agent.py).</w:t>
               <w:br/>
-              <w:t>3. Live Telegram bot (@business0psBot) alerts popping up for both Customer and Owner.</w:t>
+              <w:t>3. Live Telegram bot (@business0psBot) alerts popping up for Customer digital receipts and Manager Escalation approvals.</w:t>
               <w:br/>
-              <w:t>4. Demonstration of autonomous branching: Auto-approval (&lt;$100), Escalation (&gt;=$100), Alternative suggestion, and Clarification.</w:t>
+              <w:t>4. Demonstration of autonomous 5-way branching: Fast Sale (&lt;$100), Manager Override (&gt;=$100), Alternative suggestion, and Clarification.</w:t>
               <w:br/>
-              <w:t>5. Inspection of Google Sheets records (Products, Orders, Customers, and audit Logs).</w:t>
+              <w:t>5. Inspection of Google Sheets records (Products shelf counts, Orders register, Customers, and audit Logs).</w:t>
             </w:r>
           </w:p>
         </w:tc>
@@ -3440,7 +3440,7 @@
               <w:br/>
               <w:t>• agent.py - Main autonomous AI operations agent with DeepSeek &amp; Telegram integration</w:t>
               <w:br/>
-              <w:t>• web_app.py &amp; templates/index.html - Interactive browser testing dashboard</w:t>
+              <w:t>• web_app.py &amp; templates/index.html - Interactive AURA POS Smart Terminal web application</w:t>
               <w:br/>
               <w:t>• demo.py &amp; demo/demo-results.json - Multi-path test suite and recorded outputs</w:t>
               <w:br/>
@@ -3697,7 +3697,7 @@
               <w:rPr>
                 <w:sz w:val="17"/>
               </w:rPr>
-              <w:t>Small business retail order &amp; inventory management</w:t>
+              <w:t>Retail POS terminal &amp; small business inventory operations</w:t>
             </w:r>
           </w:p>
         </w:tc>

</xml_diff>

<commit_message>
feat(ui): redesign POS interface to match modern Elora retail terminal layout
</commit_message>
<xml_diff>
--- a/docs/AI_Business_Operations_Agent_Report.docx
+++ b/docs/AI_Business_Operations_Agent_Report.docx
@@ -2668,7 +2668,7 @@
       <w:r>
         <w:drawing>
           <wp:inline xmlns:a="http://schemas.openxmlformats.org/drawingml/2006/main" xmlns:pic="http://schemas.openxmlformats.org/drawingml/2006/picture">
-            <wp:extent cx="5120640" cy="4096512"/>
+            <wp:extent cx="5120640" cy="2880360"/>
             <wp:docPr id="3" name="Picture 3"/>
             <wp:cNvGraphicFramePr>
               <a:graphicFrameLocks noChangeAspect="1"/>
@@ -2689,7 +2689,7 @@
                   <pic:spPr>
                     <a:xfrm>
                       <a:off x="0" y="0"/>
-                      <a:ext cx="5120640" cy="4096512"/>
+                      <a:ext cx="5120640" cy="2880360"/>
                     </a:xfrm>
                     <a:prstGeom prst="rect"/>
                   </pic:spPr>
@@ -2722,7 +2722,7 @@
       <w:r>
         <w:drawing>
           <wp:inline xmlns:a="http://schemas.openxmlformats.org/drawingml/2006/main" xmlns:pic="http://schemas.openxmlformats.org/drawingml/2006/picture">
-            <wp:extent cx="5120640" cy="4096512"/>
+            <wp:extent cx="5120640" cy="2880360"/>
             <wp:docPr id="4" name="Picture 4"/>
             <wp:cNvGraphicFramePr>
               <a:graphicFrameLocks noChangeAspect="1"/>
@@ -2743,7 +2743,7 @@
                   <pic:spPr>
                     <a:xfrm>
                       <a:off x="0" y="0"/>
-                      <a:ext cx="5120640" cy="4096512"/>
+                      <a:ext cx="5120640" cy="2880360"/>
                     </a:xfrm>
                     <a:prstGeom prst="rect"/>
                   </pic:spPr>
@@ -2776,7 +2776,7 @@
       <w:r>
         <w:drawing>
           <wp:inline xmlns:a="http://schemas.openxmlformats.org/drawingml/2006/main" xmlns:pic="http://schemas.openxmlformats.org/drawingml/2006/picture">
-            <wp:extent cx="5120640" cy="4096512"/>
+            <wp:extent cx="5120640" cy="2880360"/>
             <wp:docPr id="5" name="Picture 5"/>
             <wp:cNvGraphicFramePr>
               <a:graphicFrameLocks noChangeAspect="1"/>
@@ -2797,7 +2797,7 @@
                   <pic:spPr>
                     <a:xfrm>
                       <a:off x="0" y="0"/>
-                      <a:ext cx="5120640" cy="4096512"/>
+                      <a:ext cx="5120640" cy="2880360"/>
                     </a:xfrm>
                     <a:prstGeom prst="rect"/>
                   </pic:spPr>
@@ -2830,7 +2830,7 @@
       <w:r>
         <w:drawing>
           <wp:inline xmlns:a="http://schemas.openxmlformats.org/drawingml/2006/main" xmlns:pic="http://schemas.openxmlformats.org/drawingml/2006/picture">
-            <wp:extent cx="5120640" cy="4096512"/>
+            <wp:extent cx="5120640" cy="2880360"/>
             <wp:docPr id="6" name="Picture 6"/>
             <wp:cNvGraphicFramePr>
               <a:graphicFrameLocks noChangeAspect="1"/>
@@ -2851,7 +2851,7 @@
                   <pic:spPr>
                     <a:xfrm>
                       <a:off x="0" y="0"/>
-                      <a:ext cx="5120640" cy="4096512"/>
+                      <a:ext cx="5120640" cy="2880360"/>
                     </a:xfrm>
                     <a:prstGeom prst="rect"/>
                   </pic:spPr>
@@ -2884,7 +2884,7 @@
       <w:r>
         <w:drawing>
           <wp:inline xmlns:a="http://schemas.openxmlformats.org/drawingml/2006/main" xmlns:pic="http://schemas.openxmlformats.org/drawingml/2006/picture">
-            <wp:extent cx="5120640" cy="4096512"/>
+            <wp:extent cx="5120640" cy="2880360"/>
             <wp:docPr id="7" name="Picture 7"/>
             <wp:cNvGraphicFramePr>
               <a:graphicFrameLocks noChangeAspect="1"/>
@@ -2905,7 +2905,7 @@
                   <pic:spPr>
                     <a:xfrm>
                       <a:off x="0" y="0"/>
-                      <a:ext cx="5120640" cy="4096512"/>
+                      <a:ext cx="5120640" cy="2880360"/>
                     </a:xfrm>
                     <a:prstGeom prst="rect"/>
                   </pic:spPr>

</xml_diff>

<commit_message>
feat: implement 18-node n8n workflow, direct POS checkout, and resilient UI error handling
</commit_message>
<xml_diff>
--- a/docs/AI_Business_Operations_Agent_Report.docx
+++ b/docs/AI_Business_Operations_Agent_Report.docx
@@ -310,7 +310,7 @@
     </w:p>
     <w:p>
       <w:r>
-        <w:t>The operations workflow comprises 10 distinct, sequential stages (surpassing the assignment minimum requirement of 5 steps), highlighting three AI decision points and a 5-way autonomous branching mechanism.</w:t>
+        <w:t>The operations workflow comprises 10 distinct operational capabilities organized into a 5-stage autonomous pipeline (surpassing the assignment minimum requirement of 5 steps). Stages 1 through 4 handle order ingestion, LLM intent extraction, and inventory reasoning. Stage 5 acts as an autonomous multi-path decision router that dispatches the request into one of five mutually exclusive operational branches (Approve, Escalate, Suggest Alternative, Clarify, Reject), executing branch-specific downstream actions (stock deduction, order logging, Telegram alerts, and audit logging) before returning a structured receipt.</w:t>
       </w:r>
     </w:p>
     <w:p>
@@ -321,7 +321,7 @@
       <w:r>
         <w:drawing>
           <wp:inline xmlns:a="http://schemas.openxmlformats.org/drawingml/2006/main" xmlns:pic="http://schemas.openxmlformats.org/drawingml/2006/picture">
-            <wp:extent cx="5669280" cy="4526257"/>
+            <wp:extent cx="5669280" cy="4716059"/>
             <wp:docPr id="1" name="Picture 1"/>
             <wp:cNvGraphicFramePr>
               <a:graphicFrameLocks noChangeAspect="1"/>
@@ -342,7 +342,7 @@
                   <pic:spPr>
                     <a:xfrm>
                       <a:off x="0" y="0"/>
-                      <a:ext cx="5669280" cy="4526257"/>
+                      <a:ext cx="5669280" cy="4716059"/>
                     </a:xfrm>
                     <a:prstGeom prst="rect"/>
                   </pic:spPr>
@@ -364,7 +364,7 @@
           <w:color w:val="64748B"/>
           <w:sz w:val="18"/>
         </w:rPr>
-        <w:t>Figure 1: End-to-End 10-Step AI Operations Workflow Diagram</w:t>
+        <w:t>Figure 1: End-to-End Autonomous AI Operations Architecture &amp; Branch-Specific Routing</w:t>
       </w:r>
     </w:p>
     <w:tbl>
@@ -403,7 +403,7 @@
                 <w:color w:val="FFFFFF"/>
                 <w:sz w:val="19"/>
               </w:rPr>
-              <w:t>Step #</w:t>
+              <w:t>Capability #</w:t>
             </w:r>
           </w:p>
         </w:tc>
@@ -422,7 +422,7 @@
                 <w:color w:val="FFFFFF"/>
                 <w:sz w:val="19"/>
               </w:rPr>
-              <w:t>Action Stage</w:t>
+              <w:t>Operational Stage</w:t>
             </w:r>
           </w:p>
         </w:tc>
@@ -460,7 +460,7 @@
                 <w:color w:val="FFFFFF"/>
                 <w:sz w:val="19"/>
               </w:rPr>
-              <w:t>Description</w:t>
+              <w:t>Description &amp; Execution Condition</w:t>
             </w:r>
           </w:p>
         </w:tc>
@@ -496,7 +496,7 @@
               <w:rPr>
                 <w:sz w:val="17"/>
               </w:rPr>
-              <w:t>Receive Request</w:t>
+              <w:t>Order Intake</w:t>
             </w:r>
           </w:p>
         </w:tc>
@@ -513,7 +513,7 @@
               <w:rPr>
                 <w:sz w:val="17"/>
               </w:rPr>
-              <w:t>Webhook / Web / CLI</w:t>
+              <w:t>Webhook / Web POS / CLI</w:t>
             </w:r>
           </w:p>
         </w:tc>
@@ -530,7 +530,7 @@
               <w:rPr>
                 <w:sz w:val="17"/>
               </w:rPr>
-              <w:t>Customer message enters system asynchronously.</w:t>
+              <w:t>Customer order enters system via Web POS terminal, Telegram, or webhook.</w:t>
             </w:r>
           </w:p>
         </w:tc>
@@ -596,7 +596,7 @@
               <w:rPr>
                 <w:sz w:val="17"/>
               </w:rPr>
-              <w:t>AI parses product name, variant, requested quantity, and intent.</w:t>
+              <w:t>AI extracts product name, variant, requested quantity, and intent into JSON.</w:t>
             </w:r>
           </w:p>
         </w:tc>
@@ -632,7 +632,7 @@
               <w:rPr>
                 <w:sz w:val="17"/>
               </w:rPr>
-              <w:t>Check Inventory</w:t>
+              <w:t>Read Live Inventory</w:t>
             </w:r>
           </w:p>
         </w:tc>
@@ -649,7 +649,7 @@
               <w:rPr>
                 <w:sz w:val="17"/>
               </w:rPr>
-              <w:t>Google Sheets API</w:t>
+              <w:t>Google Sheets / Excel</w:t>
             </w:r>
           </w:p>
         </w:tc>
@@ -666,7 +666,7 @@
               <w:rPr>
                 <w:sz w:val="17"/>
               </w:rPr>
-              <w:t>Reads real-time stock levels, unit pricing, and thresholds.</w:t>
+              <w:t>Fetches current shelf stock levels, SKU mappings, and threshold values.</w:t>
             </w:r>
           </w:p>
         </w:tc>
@@ -716,7 +716,7 @@
               <w:rPr>
                 <w:sz w:val="17"/>
               </w:rPr>
-              <w:t>DeepSeek LLM (Decision 2 &amp; 3)</w:t>
+              <w:t>DeepSeek LLM (Decisions 2 &amp; 3)</w:t>
             </w:r>
           </w:p>
         </w:tc>
@@ -732,7 +732,7 @@
               <w:rPr>
                 <w:sz w:val="17"/>
               </w:rPr>
-              <w:t>Compares requested quantity against stock and checks business thresholds.</w:t>
+              <w:t>AI evaluates stock availability, threshold rules ($100 rule), and product validity.</w:t>
             </w:r>
           </w:p>
         </w:tc>
@@ -768,7 +768,7 @@
               <w:rPr>
                 <w:sz w:val="17"/>
               </w:rPr>
-              <w:t>Route Workflow</w:t>
+              <w:t>Autonomous Route</w:t>
             </w:r>
           </w:p>
         </w:tc>
@@ -785,7 +785,7 @@
               <w:rPr>
                 <w:sz w:val="17"/>
               </w:rPr>
-              <w:t>Autonomous Router</w:t>
+              <w:t>5-Way AI Router</w:t>
             </w:r>
           </w:p>
         </w:tc>
@@ -802,7 +802,7 @@
               <w:rPr>
                 <w:sz w:val="17"/>
               </w:rPr>
-              <w:t>Dynamically routes to 1 of 5 paths: approve, escalate, suggest, clarify, reject.</w:t>
+              <w:t>Dynamically routes to 1 of 5 paths: approve, escalate, suggest_alt, clarify, reject.</w:t>
             </w:r>
           </w:p>
         </w:tc>
@@ -836,7 +836,7 @@
               <w:rPr>
                 <w:sz w:val="17"/>
               </w:rPr>
-              <w:t>Execute Inventory Action</w:t>
+              <w:t>Deduct Stock</w:t>
             </w:r>
           </w:p>
         </w:tc>
@@ -852,7 +852,7 @@
               <w:rPr>
                 <w:sz w:val="17"/>
               </w:rPr>
-              <w:t>Google Sheets API</w:t>
+              <w:t>Google Sheets / Excel</w:t>
             </w:r>
           </w:p>
         </w:tc>
@@ -868,7 +868,7 @@
               <w:rPr>
                 <w:sz w:val="17"/>
               </w:rPr>
-              <w:t>Deducts stock on approval; holds changes on escalation or suggestion.</w:t>
+              <w:t>Executed on APPROVE only: decrements physical shelf count in real time.</w:t>
             </w:r>
           </w:p>
         </w:tc>
@@ -921,7 +921,7 @@
               <w:rPr>
                 <w:sz w:val="17"/>
               </w:rPr>
-              <w:t>Google Sheets (Orders Sheet)</w:t>
+              <w:t>Orders Database</w:t>
             </w:r>
           </w:p>
         </w:tc>
@@ -938,7 +938,7 @@
               <w:rPr>
                 <w:sz w:val="17"/>
               </w:rPr>
-              <w:t>Logs order ID, customer name, SKU, price, timestamp, and status.</w:t>
+              <w:t>Executed on APPROVE: records order ID, customer, total price, and status.</w:t>
             </w:r>
           </w:p>
         </w:tc>
@@ -972,7 +972,7 @@
               <w:rPr>
                 <w:sz w:val="17"/>
               </w:rPr>
-              <w:t>Notify Customer</w:t>
+              <w:t>Customer Notification</w:t>
             </w:r>
           </w:p>
         </w:tc>
@@ -1004,7 +1004,7 @@
               <w:rPr>
                 <w:sz w:val="17"/>
               </w:rPr>
-              <w:t>Transmits formatted HTML order confirmation or alternative proposals to customer.</w:t>
+              <w:t>Transmits order confirmation (on approve), alternatives, or clarification prompt.</w:t>
             </w:r>
           </w:p>
         </w:tc>
@@ -1040,7 +1040,7 @@
               <w:rPr>
                 <w:sz w:val="17"/>
               </w:rPr>
-              <w:t>Alert Business Owner</w:t>
+              <w:t>Manager Escalation</w:t>
             </w:r>
           </w:p>
         </w:tc>
@@ -1074,7 +1074,7 @@
               <w:rPr>
                 <w:sz w:val="17"/>
               </w:rPr>
-              <w:t>Transmits urgent escalation message with details if order &gt;= $100.</w:t>
+              <w:t>Executed on ESCALATE only: sends urgent override alert to owner for orders &gt;= $100.</w:t>
             </w:r>
           </w:p>
         </w:tc>
@@ -1124,7 +1124,7 @@
               <w:rPr>
                 <w:sz w:val="17"/>
               </w:rPr>
-              <w:t>Google Sheets (Logs Sheet)</w:t>
+              <w:t>Logs Database</w:t>
             </w:r>
           </w:p>
         </w:tc>
@@ -1140,7 +1140,7 @@
               <w:rPr>
                 <w:sz w:val="17"/>
               </w:rPr>
-              <w:t>Appends complete trace (inputs, decisions, notifications) to Logs tab.</w:t>
+              <w:t>Executed on ALL paths: records immutable timestamped audit log of all decisions.</w:t>
             </w:r>
           </w:p>
         </w:tc>

</xml_diff>